<commit_message>
ho rimosso la tabella PUNTEGGI, avendo già i punti nella tabella UTENTI
</commit_message>
<xml_diff>
--- a/PROGETTAZIONE DATABASE.docx
+++ b/PROGETTAZIONE DATABASE.docx
@@ -2584,439 +2584,6 @@
         </w:rPr>
         <w:t>riscossione.id_premio e premi.id_premio</w:t>
       </w:r>
-      <w:r>
-        <w:rPr>
-          <w:color w:val="0070C0"/>
-          <w:sz w:val="24"/>
-          <w:szCs w:val="24"/>
-        </w:rPr>
-        <w:br/>
-      </w:r>
-      <w:r>
-        <w:rPr>
-          <w:color w:val="0070C0"/>
-          <w:sz w:val="24"/>
-          <w:szCs w:val="24"/>
-        </w:rPr>
-        <w:br/>
-      </w:r>
-      <w:r>
-        <w:rPr>
-          <w:b/>
-          <w:bCs/>
-          <w:sz w:val="24"/>
-          <w:szCs w:val="24"/>
-        </w:rPr>
-        <w:t xml:space="preserve">TABELLA </w:t>
-      </w:r>
-      <w:r>
-        <w:rPr>
-          <w:b/>
-          <w:bCs/>
-          <w:sz w:val="24"/>
-          <w:szCs w:val="24"/>
-        </w:rPr>
-        <w:t>PUNTEGGI</w:t>
-      </w:r>
-      <w:r>
-        <w:rPr>
-          <w:b/>
-          <w:bCs/>
-          <w:sz w:val="24"/>
-          <w:szCs w:val="24"/>
-        </w:rPr>
-        <w:t xml:space="preserve"> (</w:t>
-      </w:r>
-      <w:r>
-        <w:rPr>
-          <w:b/>
-          <w:bCs/>
-          <w:sz w:val="24"/>
-          <w:szCs w:val="24"/>
-        </w:rPr>
-        <w:t>entità</w:t>
-      </w:r>
-      <w:r>
-        <w:rPr>
-          <w:b/>
-          <w:bCs/>
-          <w:sz w:val="24"/>
-          <w:szCs w:val="24"/>
-        </w:rPr>
-        <w:t xml:space="preserve">) </w:t>
-      </w:r>
-      <w:r>
-        <w:rPr>
-          <w:b/>
-          <w:bCs/>
-          <w:sz w:val="24"/>
-          <w:szCs w:val="24"/>
-        </w:rPr>
-        <w:br/>
-      </w:r>
-      <w:r>
-        <w:rPr>
-          <w:color w:val="000000" w:themeColor="text1"/>
-        </w:rPr>
-        <w:t xml:space="preserve">La tabella </w:t>
-      </w:r>
-      <w:r>
-        <w:rPr>
-          <w:color w:val="000000" w:themeColor="text1"/>
-        </w:rPr>
-        <w:t>PUNTEGGI</w:t>
-      </w:r>
-      <w:r>
-        <w:rPr>
-          <w:color w:val="000000" w:themeColor="text1"/>
-        </w:rPr>
-        <w:t xml:space="preserve"> </w:t>
-      </w:r>
-      <w:r>
-        <w:rPr>
-          <w:color w:val="000000" w:themeColor="text1"/>
-        </w:rPr>
-        <w:t>mi crea una tabella</w:t>
-      </w:r>
-      <w:r>
-        <w:rPr>
-          <w:color w:val="000000" w:themeColor="text1"/>
-        </w:rPr>
-        <w:t xml:space="preserve"> degli utenti </w:t>
-      </w:r>
-      <w:r>
-        <w:rPr>
-          <w:color w:val="000000" w:themeColor="text1"/>
-        </w:rPr>
-        <w:t>con i relativi</w:t>
-      </w:r>
-      <w:r>
-        <w:rPr>
-          <w:color w:val="000000" w:themeColor="text1"/>
-        </w:rPr>
-        <w:t xml:space="preserve"> punti accumulat</w:t>
-      </w:r>
-      <w:r>
-        <w:rPr>
-          <w:color w:val="000000" w:themeColor="text1"/>
-        </w:rPr>
-        <w:t>i.</w:t>
-      </w:r>
-      <w:r>
-        <w:rPr>
-          <w:color w:val="000000" w:themeColor="text1"/>
-        </w:rPr>
-        <w:br/>
-        <w:t xml:space="preserve">Calcolo la posizione in classifica dell’ utente con la query </w:t>
-      </w:r>
-      <w:r>
-        <w:rPr>
-          <w:color w:val="000000" w:themeColor="text1"/>
-        </w:rPr>
-        <w:br/>
-        <w:t>(SELECT * FROM punteggi ORDER BY punti DESC)</w:t>
-      </w:r>
-    </w:p>
-    <w:tbl>
-      <w:tblPr>
-        <w:tblStyle w:val="Grigliatabella"/>
-        <w:tblW w:w="0" w:type="auto"/>
-        <w:tblLook w:val="04A0" w:firstRow="1" w:lastRow="0" w:firstColumn="1" w:lastColumn="0" w:noHBand="0" w:noVBand="1"/>
-      </w:tblPr>
-      <w:tblGrid>
-        <w:gridCol w:w="3721"/>
-        <w:gridCol w:w="1964"/>
-        <w:gridCol w:w="3943"/>
-      </w:tblGrid>
-      <w:tr>
-        <w:tc>
-          <w:tcPr>
-            <w:tcW w:w="3721" w:type="dxa"/>
-            <w:shd w:val="clear" w:color="auto" w:fill="FFFF00"/>
-          </w:tcPr>
-          <w:p>
-            <w:pPr>
-              <w:jc w:val="center"/>
-              <w:rPr>
-                <w:b/>
-                <w:bCs/>
-              </w:rPr>
-            </w:pPr>
-            <w:r>
-              <w:rPr>
-                <w:b/>
-                <w:bCs/>
-              </w:rPr>
-              <w:t>ATTRIBUTO</w:t>
-            </w:r>
-          </w:p>
-        </w:tc>
-        <w:tc>
-          <w:tcPr>
-            <w:tcW w:w="1964" w:type="dxa"/>
-            <w:shd w:val="clear" w:color="auto" w:fill="FFFF00"/>
-          </w:tcPr>
-          <w:p>
-            <w:pPr>
-              <w:jc w:val="center"/>
-              <w:rPr>
-                <w:b/>
-                <w:bCs/>
-              </w:rPr>
-            </w:pPr>
-            <w:r>
-              <w:rPr>
-                <w:b/>
-                <w:bCs/>
-              </w:rPr>
-              <w:t>TIPO</w:t>
-            </w:r>
-          </w:p>
-        </w:tc>
-        <w:tc>
-          <w:tcPr>
-            <w:tcW w:w="3943" w:type="dxa"/>
-            <w:shd w:val="clear" w:color="auto" w:fill="FFFF00"/>
-          </w:tcPr>
-          <w:p>
-            <w:pPr>
-              <w:jc w:val="center"/>
-              <w:rPr>
-                <w:b/>
-                <w:bCs/>
-              </w:rPr>
-            </w:pPr>
-            <w:r>
-              <w:rPr>
-                <w:b/>
-                <w:bCs/>
-              </w:rPr>
-              <w:t>VINCOLI</w:t>
-            </w:r>
-          </w:p>
-        </w:tc>
-      </w:tr>
-      <w:tr>
-        <w:tc>
-          <w:tcPr>
-            <w:tcW w:w="3721" w:type="dxa"/>
-            <w:shd w:val="clear" w:color="auto" w:fill="auto"/>
-          </w:tcPr>
-          <w:p>
-            <w:pPr>
-              <w:jc w:val="center"/>
-              <w:rPr>
-                <w:b/>
-                <w:bCs/>
-              </w:rPr>
-            </w:pPr>
-            <w:r>
-              <w:rPr>
-                <w:b/>
-                <w:bCs/>
-              </w:rPr>
-              <w:t>id_</w:t>
-            </w:r>
-            <w:r>
-              <w:rPr>
-                <w:b/>
-                <w:bCs/>
-              </w:rPr>
-              <w:t>punteggio</w:t>
-            </w:r>
-          </w:p>
-        </w:tc>
-        <w:tc>
-          <w:tcPr>
-            <w:tcW w:w="1964" w:type="dxa"/>
-            <w:shd w:val="clear" w:color="auto" w:fill="auto"/>
-          </w:tcPr>
-          <w:p>
-            <w:pPr>
-              <w:jc w:val="center"/>
-              <w:rPr>
-                <w:b/>
-                <w:bCs/>
-              </w:rPr>
-            </w:pPr>
-            <w:r>
-              <w:t>INT</w:t>
-            </w:r>
-          </w:p>
-        </w:tc>
-        <w:tc>
-          <w:tcPr>
-            <w:tcW w:w="3943" w:type="dxa"/>
-            <w:shd w:val="clear" w:color="auto" w:fill="auto"/>
-          </w:tcPr>
-          <w:p>
-            <w:pPr>
-              <w:jc w:val="center"/>
-              <w:rPr>
-                <w:b/>
-                <w:bCs/>
-              </w:rPr>
-            </w:pPr>
-            <w:r>
-              <w:t>PK</w:t>
-            </w:r>
-          </w:p>
-        </w:tc>
-      </w:tr>
-      <w:tr>
-        <w:tc>
-          <w:tcPr>
-            <w:tcW w:w="3721" w:type="dxa"/>
-          </w:tcPr>
-          <w:p>
-            <w:pPr>
-              <w:jc w:val="center"/>
-              <w:rPr>
-                <w:b/>
-                <w:bCs/>
-              </w:rPr>
-            </w:pPr>
-            <w:r>
-              <w:t>id_utente</w:t>
-            </w:r>
-            <w:r>
-              <w:t xml:space="preserve"> </w:t>
-            </w:r>
-            <w:r>
-              <w:rPr>
-                <w:b/>
-                <w:bCs/>
-              </w:rPr>
-              <w:t>*</w:t>
-            </w:r>
-          </w:p>
-        </w:tc>
-        <w:tc>
-          <w:tcPr>
-            <w:tcW w:w="1964" w:type="dxa"/>
-          </w:tcPr>
-          <w:p>
-            <w:pPr>
-              <w:jc w:val="center"/>
-            </w:pPr>
-            <w:r>
-              <w:t>INT</w:t>
-            </w:r>
-          </w:p>
-        </w:tc>
-        <w:tc>
-          <w:tcPr>
-            <w:tcW w:w="3943" w:type="dxa"/>
-          </w:tcPr>
-          <w:p>
-            <w:pPr>
-              <w:jc w:val="center"/>
-            </w:pPr>
-            <w:r>
-              <w:t>FK</w:t>
-            </w:r>
-          </w:p>
-        </w:tc>
-      </w:tr>
-      <w:tr>
-        <w:tc>
-          <w:tcPr>
-            <w:tcW w:w="3721" w:type="dxa"/>
-          </w:tcPr>
-          <w:p>
-            <w:pPr>
-              <w:jc w:val="center"/>
-            </w:pPr>
-            <w:r>
-              <w:lastRenderedPageBreak/>
-              <w:t>punti</w:t>
-            </w:r>
-          </w:p>
-        </w:tc>
-        <w:tc>
-          <w:tcPr>
-            <w:tcW w:w="1964" w:type="dxa"/>
-          </w:tcPr>
-          <w:p>
-            <w:pPr>
-              <w:jc w:val="center"/>
-            </w:pPr>
-            <w:r>
-              <w:t>INT</w:t>
-            </w:r>
-          </w:p>
-        </w:tc>
-        <w:tc>
-          <w:tcPr>
-            <w:tcW w:w="3943" w:type="dxa"/>
-          </w:tcPr>
-          <w:p>
-            <w:pPr>
-              <w:jc w:val="center"/>
-            </w:pPr>
-            <w:r>
-              <w:t>&gt; 0</w:t>
-            </w:r>
-          </w:p>
-        </w:tc>
-      </w:tr>
-    </w:tbl>
-    <w:p>
-      <w:pPr>
-        <w:rPr>
-          <w:color w:val="0070C0"/>
-          <w:sz w:val="24"/>
-          <w:szCs w:val="24"/>
-        </w:rPr>
-      </w:pPr>
-      <w:r>
-        <w:rPr>
-          <w:color w:val="0070C0"/>
-          <w:sz w:val="24"/>
-          <w:szCs w:val="24"/>
-        </w:rPr>
-        <w:br/>
-      </w:r>
-      <w:r>
-        <w:rPr>
-          <w:color w:val="0070C0"/>
-          <w:sz w:val="24"/>
-          <w:szCs w:val="24"/>
-        </w:rPr>
-        <w:t>VINCOL</w:t>
-      </w:r>
-      <w:r>
-        <w:rPr>
-          <w:color w:val="0070C0"/>
-          <w:sz w:val="24"/>
-          <w:szCs w:val="24"/>
-        </w:rPr>
-        <w:t>I</w:t>
-      </w:r>
-      <w:r>
-        <w:rPr>
-          <w:color w:val="0070C0"/>
-          <w:sz w:val="24"/>
-          <w:szCs w:val="24"/>
-        </w:rPr>
-        <w:t xml:space="preserve"> DI INTEGRITÀ REFERENZIALE: Tra </w:t>
-      </w:r>
-      <w:r>
-        <w:rPr>
-          <w:color w:val="0070C0"/>
-          <w:sz w:val="24"/>
-          <w:szCs w:val="24"/>
-        </w:rPr>
-        <w:t>punteggi</w:t>
-      </w:r>
-      <w:r>
-        <w:rPr>
-          <w:color w:val="0070C0"/>
-          <w:sz w:val="24"/>
-          <w:szCs w:val="24"/>
-        </w:rPr>
-        <w:t>.id_utente e utenti.id_utente</w:t>
-      </w:r>
     </w:p>
     <w:p>
       <w:pPr>
@@ -3229,6 +2796,7 @@
           <w:rFonts w:eastAsia="Times New Roman" w:cs="Times New Roman"/>
           <w:lang w:eastAsia="it-IT"/>
         </w:rPr>
+        <w:lastRenderedPageBreak/>
         <w:t>Tabella obiettivi con distinzione in sfide</w:t>
       </w:r>
       <w:r>

</xml_diff>

<commit_message>
ho rimosso la tabella RISCOSSIONE, che risultava ridondante con la tabella PREMI (dato che un premio NON può essere riscattato da utenti diversi)
</commit_message>
<xml_diff>
--- a/PROGETTAZIONE DATABASE.docx
+++ b/PROGETTAZIONE DATABASE.docx
@@ -376,9 +376,11 @@
             <w:pPr>
               <w:jc w:val="center"/>
             </w:pPr>
+            <w:proofErr w:type="gramStart"/>
             <w:r>
               <w:t>email</w:t>
             </w:r>
+            <w:proofErr w:type="gramEnd"/>
           </w:p>
         </w:tc>
         <w:tc>
@@ -591,7 +593,7 @@
         <w:t>sfide (coinvolgono due utenti</w:t>
       </w:r>
       <w:r>
-        <w:t>, un utente sfidante offre parte dei suoi punti e chiede di fare qualcosa ad un altro utente, che può decidere di accettare/rifiutare la sfida)</w:t>
+        <w:t>, un utente sfidante offre parte dei suoi punti e chiede di fare qualcosa ad un altro utente, che può decidere se accettare/rifiutare la sfida)</w:t>
       </w:r>
       <w:r>
         <w:t>.</w:t>
@@ -1079,7 +1081,21 @@
         <w:rPr>
           <w:color w:val="000000" w:themeColor="text1"/>
         </w:rPr>
-        <w:t xml:space="preserve">PARTECIPAZIONE, in modo che se una sfida aveva valore 5 punti ma è scaduta oppure è stata rifiutata dall’utente, </w:t>
+        <w:t xml:space="preserve">PARTECIPAZIONE, in modo </w:t>
+      </w:r>
+      <w:proofErr w:type="gramStart"/>
+      <w:r>
+        <w:rPr>
+          <w:color w:val="000000" w:themeColor="text1"/>
+        </w:rPr>
+        <w:t>che</w:t>
+      </w:r>
+      <w:proofErr w:type="gramEnd"/>
+      <w:r>
+        <w:rPr>
+          <w:color w:val="000000" w:themeColor="text1"/>
+        </w:rPr>
+        <w:t xml:space="preserve"> se una sfida aveva valore 5 punti ma è scaduta oppure è stata rifiutata dall’utente, </w:t>
       </w:r>
       <w:r>
         <w:rPr>
@@ -1740,434 +1756,6 @@
       </w:r>
     </w:p>
     <w:p>
-      <w:r>
-        <w:rPr>
-          <w:color w:val="0070C0"/>
-          <w:sz w:val="24"/>
-          <w:szCs w:val="24"/>
-        </w:rPr>
-        <w:t>VINCOL</w:t>
-      </w:r>
-      <w:r>
-        <w:rPr>
-          <w:color w:val="0070C0"/>
-          <w:sz w:val="24"/>
-          <w:szCs w:val="24"/>
-        </w:rPr>
-        <w:t>I</w:t>
-      </w:r>
-      <w:r>
-        <w:rPr>
-          <w:color w:val="0070C0"/>
-          <w:sz w:val="24"/>
-          <w:szCs w:val="24"/>
-        </w:rPr>
-        <w:t xml:space="preserve"> DI INTEGRITÀ REFERENZIALE: Tra </w:t>
-      </w:r>
-      <w:r>
-        <w:rPr>
-          <w:color w:val="0070C0"/>
-          <w:sz w:val="24"/>
-          <w:szCs w:val="24"/>
-        </w:rPr>
-        <w:t xml:space="preserve">partecipazione.id_utente_sfidante e </w:t>
-      </w:r>
-      <w:r>
-        <w:rPr>
-          <w:color w:val="0070C0"/>
-          <w:sz w:val="24"/>
-          <w:szCs w:val="24"/>
-        </w:rPr>
-        <w:t>utenti.id_utente</w:t>
-      </w:r>
-      <w:r>
-        <w:rPr>
-          <w:color w:val="0070C0"/>
-          <w:sz w:val="24"/>
-          <w:szCs w:val="24"/>
-        </w:rPr>
-        <w:t>_sfidante</w:t>
-      </w:r>
-      <w:r>
-        <w:rPr>
-          <w:color w:val="0070C0"/>
-          <w:sz w:val="24"/>
-          <w:szCs w:val="24"/>
-        </w:rPr>
-        <w:br/>
-      </w:r>
-      <w:r>
-        <w:rPr>
-          <w:b/>
-          <w:bCs/>
-          <w:sz w:val="24"/>
-          <w:szCs w:val="24"/>
-        </w:rPr>
-        <w:br/>
-      </w:r>
-      <w:r>
-        <w:rPr>
-          <w:b/>
-          <w:bCs/>
-          <w:sz w:val="24"/>
-          <w:szCs w:val="24"/>
-        </w:rPr>
-        <w:t>TABELLA PREMI (entità)</w:t>
-      </w:r>
-      <w:r>
-        <w:rPr>
-          <w:b/>
-          <w:bCs/>
-        </w:rPr>
-        <w:br/>
-      </w:r>
-      <w:r>
-        <w:t>Tabella dei premi</w:t>
-      </w:r>
-      <w:r>
-        <w:t xml:space="preserve"> che possono essere riscattati dagli utenti</w:t>
-      </w:r>
-      <w:r>
-        <w:t xml:space="preserve"> (I premi sono personali per ogni utente, uno stesso premio NON può essere riscattato da utenti diversi).</w:t>
-      </w:r>
-      <w:r>
-        <w:br/>
-        <w:t>Con il campo punti_richiesti indico il numero di punti necessari a riscattare quel premio.</w:t>
-      </w:r>
-    </w:p>
-    <w:tbl>
-      <w:tblPr>
-        <w:tblStyle w:val="Grigliatabella"/>
-        <w:tblW w:w="0" w:type="auto"/>
-        <w:tblInd w:w="-5" w:type="dxa"/>
-        <w:tblLook w:val="04A0" w:firstRow="1" w:lastRow="0" w:firstColumn="1" w:lastColumn="0" w:noHBand="0" w:noVBand="1"/>
-      </w:tblPr>
-      <w:tblGrid>
-        <w:gridCol w:w="4316"/>
-        <w:gridCol w:w="2228"/>
-        <w:gridCol w:w="3089"/>
-      </w:tblGrid>
-      <w:tr>
-        <w:tc>
-          <w:tcPr>
-            <w:tcW w:w="4316" w:type="dxa"/>
-            <w:shd w:val="clear" w:color="auto" w:fill="FFFF00"/>
-          </w:tcPr>
-          <w:p>
-            <w:pPr>
-              <w:jc w:val="center"/>
-              <w:rPr>
-                <w:b/>
-                <w:bCs/>
-              </w:rPr>
-            </w:pPr>
-            <w:r>
-              <w:rPr>
-                <w:b/>
-                <w:bCs/>
-              </w:rPr>
-              <w:t>ATTRIBUTO</w:t>
-            </w:r>
-          </w:p>
-        </w:tc>
-        <w:tc>
-          <w:tcPr>
-            <w:tcW w:w="2228" w:type="dxa"/>
-            <w:shd w:val="clear" w:color="auto" w:fill="FFFF00"/>
-          </w:tcPr>
-          <w:p>
-            <w:pPr>
-              <w:jc w:val="center"/>
-              <w:rPr>
-                <w:b/>
-                <w:bCs/>
-              </w:rPr>
-            </w:pPr>
-            <w:r>
-              <w:rPr>
-                <w:b/>
-                <w:bCs/>
-              </w:rPr>
-              <w:t>TIPO</w:t>
-            </w:r>
-          </w:p>
-        </w:tc>
-        <w:tc>
-          <w:tcPr>
-            <w:tcW w:w="3089" w:type="dxa"/>
-            <w:shd w:val="clear" w:color="auto" w:fill="FFFF00"/>
-          </w:tcPr>
-          <w:p>
-            <w:pPr>
-              <w:jc w:val="center"/>
-              <w:rPr>
-                <w:b/>
-                <w:bCs/>
-              </w:rPr>
-            </w:pPr>
-            <w:r>
-              <w:rPr>
-                <w:b/>
-                <w:bCs/>
-              </w:rPr>
-              <w:t>VINCOLI</w:t>
-            </w:r>
-          </w:p>
-        </w:tc>
-      </w:tr>
-      <w:tr>
-        <w:tc>
-          <w:tcPr>
-            <w:tcW w:w="4316" w:type="dxa"/>
-          </w:tcPr>
-          <w:p>
-            <w:pPr>
-              <w:jc w:val="center"/>
-              <w:rPr>
-                <w:b/>
-                <w:bCs/>
-              </w:rPr>
-            </w:pPr>
-            <w:r>
-              <w:rPr>
-                <w:b/>
-                <w:bCs/>
-              </w:rPr>
-              <w:t>id_</w:t>
-            </w:r>
-            <w:r>
-              <w:rPr>
-                <w:b/>
-                <w:bCs/>
-              </w:rPr>
-              <w:t>premio</w:t>
-            </w:r>
-          </w:p>
-        </w:tc>
-        <w:tc>
-          <w:tcPr>
-            <w:tcW w:w="2228" w:type="dxa"/>
-          </w:tcPr>
-          <w:p>
-            <w:pPr>
-              <w:jc w:val="center"/>
-            </w:pPr>
-            <w:r>
-              <w:t>INT</w:t>
-            </w:r>
-          </w:p>
-        </w:tc>
-        <w:tc>
-          <w:tcPr>
-            <w:tcW w:w="3089" w:type="dxa"/>
-          </w:tcPr>
-          <w:p>
-            <w:pPr>
-              <w:jc w:val="center"/>
-            </w:pPr>
-            <w:r>
-              <w:t>PK</w:t>
-            </w:r>
-          </w:p>
-        </w:tc>
-      </w:tr>
-      <w:tr>
-        <w:tc>
-          <w:tcPr>
-            <w:tcW w:w="4316" w:type="dxa"/>
-          </w:tcPr>
-          <w:p>
-            <w:pPr>
-              <w:jc w:val="center"/>
-              <w:rPr>
-                <w:b/>
-                <w:bCs/>
-              </w:rPr>
-            </w:pPr>
-            <w:r>
-              <w:rPr>
-                <w:b/>
-                <w:bCs/>
-              </w:rPr>
-              <w:t>id_</w:t>
-            </w:r>
-            <w:r>
-              <w:rPr>
-                <w:b/>
-                <w:bCs/>
-              </w:rPr>
-              <w:t xml:space="preserve">utente </w:t>
-            </w:r>
-            <w:r>
-              <w:rPr>
-                <w:b/>
-                <w:bCs/>
-              </w:rPr>
-              <w:t>*</w:t>
-            </w:r>
-          </w:p>
-        </w:tc>
-        <w:tc>
-          <w:tcPr>
-            <w:tcW w:w="2228" w:type="dxa"/>
-          </w:tcPr>
-          <w:p>
-            <w:pPr>
-              <w:jc w:val="center"/>
-            </w:pPr>
-            <w:r>
-              <w:t>INT</w:t>
-            </w:r>
-          </w:p>
-        </w:tc>
-        <w:tc>
-          <w:tcPr>
-            <w:tcW w:w="3089" w:type="dxa"/>
-          </w:tcPr>
-          <w:p>
-            <w:pPr>
-              <w:jc w:val="center"/>
-            </w:pPr>
-            <w:r>
-              <w:t>PK</w:t>
-            </w:r>
-            <w:r>
-              <w:t>, FK</w:t>
-            </w:r>
-          </w:p>
-        </w:tc>
-      </w:tr>
-      <w:tr>
-        <w:tc>
-          <w:tcPr>
-            <w:tcW w:w="4316" w:type="dxa"/>
-          </w:tcPr>
-          <w:p>
-            <w:pPr>
-              <w:jc w:val="center"/>
-            </w:pPr>
-            <w:r>
-              <w:t>nome_premio</w:t>
-            </w:r>
-          </w:p>
-        </w:tc>
-        <w:tc>
-          <w:tcPr>
-            <w:tcW w:w="2228" w:type="dxa"/>
-          </w:tcPr>
-          <w:p>
-            <w:pPr>
-              <w:jc w:val="center"/>
-            </w:pPr>
-            <w:r>
-              <w:t>VARCHAR</w:t>
-            </w:r>
-          </w:p>
-        </w:tc>
-        <w:tc>
-          <w:tcPr>
-            <w:tcW w:w="3089" w:type="dxa"/>
-          </w:tcPr>
-          <w:p>
-            <w:pPr>
-              <w:jc w:val="center"/>
-            </w:pPr>
-            <w:r>
-              <w:t>VARCHAR</w:t>
-            </w:r>
-          </w:p>
-        </w:tc>
-      </w:tr>
-      <w:tr>
-        <w:trPr>
-          <w:trHeight w:val="44"/>
-        </w:trPr>
-        <w:tc>
-          <w:tcPr>
-            <w:tcW w:w="4316" w:type="dxa"/>
-          </w:tcPr>
-          <w:p>
-            <w:pPr>
-              <w:jc w:val="center"/>
-            </w:pPr>
-            <w:r>
-              <w:t>punti_richiesti</w:t>
-            </w:r>
-          </w:p>
-        </w:tc>
-        <w:tc>
-          <w:tcPr>
-            <w:tcW w:w="2228" w:type="dxa"/>
-          </w:tcPr>
-          <w:p>
-            <w:pPr>
-              <w:jc w:val="center"/>
-            </w:pPr>
-            <w:r>
-              <w:t>INT</w:t>
-            </w:r>
-          </w:p>
-        </w:tc>
-        <w:tc>
-          <w:tcPr>
-            <w:tcW w:w="3089" w:type="dxa"/>
-          </w:tcPr>
-          <w:p>
-            <w:pPr>
-              <w:jc w:val="center"/>
-            </w:pPr>
-            <w:r>
-              <w:t>&gt; 0</w:t>
-            </w:r>
-          </w:p>
-        </w:tc>
-      </w:tr>
-      <w:tr>
-        <w:trPr>
-          <w:trHeight w:val="44"/>
-        </w:trPr>
-        <w:tc>
-          <w:tcPr>
-            <w:tcW w:w="4316" w:type="dxa"/>
-          </w:tcPr>
-          <w:p>
-            <w:pPr>
-              <w:jc w:val="center"/>
-            </w:pPr>
-            <w:r>
-              <w:t>data_riscossione</w:t>
-            </w:r>
-          </w:p>
-        </w:tc>
-        <w:tc>
-          <w:tcPr>
-            <w:tcW w:w="2228" w:type="dxa"/>
-          </w:tcPr>
-          <w:p>
-            <w:pPr>
-              <w:jc w:val="center"/>
-            </w:pPr>
-            <w:r>
-              <w:t>DATE</w:t>
-            </w:r>
-          </w:p>
-        </w:tc>
-        <w:tc>
-          <w:tcPr>
-            <w:tcW w:w="3089" w:type="dxa"/>
-          </w:tcPr>
-          <w:p>
-            <w:pPr>
-              <w:jc w:val="center"/>
-            </w:pPr>
-            <w:r>
-              <w:t>NOT NULL</w:t>
-            </w:r>
-          </w:p>
-        </w:tc>
-      </w:tr>
-    </w:tbl>
-    <w:p>
       <w:pPr>
         <w:rPr>
           <w:b/>
@@ -2177,6 +1765,54 @@
           <w:szCs w:val="24"/>
         </w:rPr>
       </w:pPr>
+      <w:r>
+        <w:rPr>
+          <w:color w:val="0070C0"/>
+          <w:sz w:val="24"/>
+          <w:szCs w:val="24"/>
+        </w:rPr>
+        <w:t>VINCOL</w:t>
+      </w:r>
+      <w:r>
+        <w:rPr>
+          <w:color w:val="0070C0"/>
+          <w:sz w:val="24"/>
+          <w:szCs w:val="24"/>
+        </w:rPr>
+        <w:t>I</w:t>
+      </w:r>
+      <w:r>
+        <w:rPr>
+          <w:color w:val="0070C0"/>
+          <w:sz w:val="24"/>
+          <w:szCs w:val="24"/>
+        </w:rPr>
+        <w:t xml:space="preserve"> DI INTEGRITÀ REFERENZIALE: Tra </w:t>
+      </w:r>
+      <w:r>
+        <w:rPr>
+          <w:color w:val="0070C0"/>
+          <w:sz w:val="24"/>
+          <w:szCs w:val="24"/>
+        </w:rPr>
+        <w:t xml:space="preserve">partecipazione.id_utente_sfidante e </w:t>
+      </w:r>
+      <w:r>
+        <w:rPr>
+          <w:color w:val="0070C0"/>
+          <w:sz w:val="24"/>
+          <w:szCs w:val="24"/>
+        </w:rPr>
+        <w:t>utenti.id_utente</w:t>
+      </w:r>
+      <w:r>
+        <w:rPr>
+          <w:color w:val="0070C0"/>
+          <w:sz w:val="24"/>
+          <w:szCs w:val="24"/>
+        </w:rPr>
+        <w:t>_sfidante</w:t>
+      </w:r>
     </w:p>
     <w:p>
       <w:pPr>
@@ -2192,50 +1828,59 @@
           <w:sz w:val="24"/>
           <w:szCs w:val="24"/>
         </w:rPr>
-        <w:t>TABELLA RISCOSSIONE (associazione tra utenti e premi)</w:t>
+        <w:t xml:space="preserve">TABELLA </w:t>
       </w:r>
       <w:r>
         <w:rPr>
           <w:b/>
           <w:bCs/>
+          <w:sz w:val="24"/>
+          <w:szCs w:val="24"/>
+        </w:rPr>
+        <w:t>PREMI</w:t>
+      </w:r>
+      <w:r>
+        <w:rPr>
+          <w:b/>
+          <w:bCs/>
+          <w:sz w:val="24"/>
+          <w:szCs w:val="24"/>
+        </w:rPr>
+        <w:t xml:space="preserve"> (entità)</w:t>
+      </w:r>
+      <w:r>
+        <w:rPr>
+          <w:b/>
+          <w:bCs/>
+          <w:sz w:val="24"/>
+          <w:szCs w:val="24"/>
         </w:rPr>
         <w:br/>
       </w:r>
       <w:r>
-        <w:rPr>
-          <w:color w:val="000000" w:themeColor="text1"/>
-        </w:rPr>
-        <w:t xml:space="preserve">I premi sono collegati agli utenti attraverso </w:t>
-      </w:r>
-      <w:r>
-        <w:rPr>
-          <w:color w:val="000000" w:themeColor="text1"/>
-        </w:rPr>
-        <w:t>data_riscossione</w:t>
-      </w:r>
-      <w:r>
-        <w:rPr>
-          <w:color w:val="000000" w:themeColor="text1"/>
-        </w:rPr>
-        <w:t>, consentendo di monitorare quali premi sono stati riscattat</w:t>
-      </w:r>
-      <w:r>
-        <w:rPr>
-          <w:color w:val="000000" w:themeColor="text1"/>
-        </w:rPr>
-        <w:t>i,</w:t>
-      </w:r>
-      <w:r>
-        <w:rPr>
-          <w:color w:val="000000" w:themeColor="text1"/>
-        </w:rPr>
-        <w:t xml:space="preserve"> da chi</w:t>
-      </w:r>
-      <w:r>
-        <w:rPr>
-          <w:color w:val="000000" w:themeColor="text1"/>
-        </w:rPr>
-        <w:t>, in quale data, in modo da tener traccia dello storico premi per ogni utente.</w:t>
+        <w:t>Tabella dei premi</w:t>
+      </w:r>
+      <w:r>
+        <w:t xml:space="preserve"> che possono essere riscattati dagli utenti</w:t>
+      </w:r>
+      <w:r>
+        <w:t xml:space="preserve"> (</w:t>
+      </w:r>
+      <w:r>
+        <w:t xml:space="preserve">Ogni premio è univoco e </w:t>
+      </w:r>
+      <w:r>
+        <w:t>NON</w:t>
+      </w:r>
+      <w:r>
+        <w:t xml:space="preserve"> può essere riscattato da più utenti</w:t>
+      </w:r>
+      <w:r>
+        <w:t>, per questa ragione id_premio è sufficiente come PK).</w:t>
+      </w:r>
+      <w:r>
+        <w:br/>
+        <w:t>Con il campo punti_richiesti indico il numero di punti necessari a riscattare quel premio.</w:t>
       </w:r>
     </w:p>
     <w:tbl>
@@ -2321,6 +1966,7 @@
         <w:tc>
           <w:tcPr>
             <w:tcW w:w="4311" w:type="dxa"/>
+            <w:shd w:val="clear" w:color="auto" w:fill="auto"/>
           </w:tcPr>
           <w:p>
             <w:pPr>
@@ -2342,24 +1988,22 @@
                 <w:b/>
                 <w:bCs/>
               </w:rPr>
-              <w:t xml:space="preserve">utente </w:t>
-            </w:r>
-            <w:r>
-              <w:rPr>
-                <w:b/>
-                <w:bCs/>
-              </w:rPr>
-              <w:t>*</w:t>
+              <w:t>premio</w:t>
             </w:r>
           </w:p>
         </w:tc>
         <w:tc>
           <w:tcPr>
             <w:tcW w:w="2228" w:type="dxa"/>
-          </w:tcPr>
-          <w:p>
-            <w:pPr>
-              <w:jc w:val="center"/>
+            <w:shd w:val="clear" w:color="auto" w:fill="auto"/>
+          </w:tcPr>
+          <w:p>
+            <w:pPr>
+              <w:jc w:val="center"/>
+              <w:rPr>
+                <w:b/>
+                <w:bCs/>
+              </w:rPr>
             </w:pPr>
             <w:r>
               <w:t>INT</w:t>
@@ -2369,16 +2013,18 @@
         <w:tc>
           <w:tcPr>
             <w:tcW w:w="3089" w:type="dxa"/>
-          </w:tcPr>
-          <w:p>
-            <w:pPr>
-              <w:jc w:val="center"/>
+            <w:shd w:val="clear" w:color="auto" w:fill="auto"/>
+          </w:tcPr>
+          <w:p>
+            <w:pPr>
+              <w:jc w:val="center"/>
+              <w:rPr>
+                <w:b/>
+                <w:bCs/>
+              </w:rPr>
             </w:pPr>
             <w:r>
               <w:t>PK</w:t>
-            </w:r>
-            <w:r>
-              <w:t>, FK</w:t>
             </w:r>
           </w:p>
         </w:tc>
@@ -2391,20 +2037,20 @@
           <w:p>
             <w:pPr>
               <w:jc w:val="center"/>
-            </w:pPr>
-            <w:r>
-              <w:rPr>
-                <w:b/>
-                <w:bCs/>
-              </w:rPr>
-              <w:t>id_</w:t>
-            </w:r>
-            <w:r>
-              <w:rPr>
-                <w:b/>
-                <w:bCs/>
-              </w:rPr>
-              <w:t xml:space="preserve">premio </w:t>
+              <w:rPr>
+                <w:b/>
+                <w:bCs/>
+              </w:rPr>
+            </w:pPr>
+            <w:r>
+              <w:t>id_utente</w:t>
+            </w:r>
+            <w:r>
+              <w:rPr>
+                <w:b/>
+                <w:bCs/>
+              </w:rPr>
+              <w:t xml:space="preserve"> </w:t>
             </w:r>
             <w:r>
               <w:rPr>
@@ -2437,10 +2083,93 @@
               <w:jc w:val="center"/>
             </w:pPr>
             <w:r>
-              <w:t>PK</w:t>
-            </w:r>
-            <w:r>
-              <w:t>, FK</w:t>
+              <w:t>FK</w:t>
+            </w:r>
+          </w:p>
+        </w:tc>
+      </w:tr>
+      <w:tr>
+        <w:tc>
+          <w:tcPr>
+            <w:tcW w:w="4311" w:type="dxa"/>
+          </w:tcPr>
+          <w:p>
+            <w:pPr>
+              <w:jc w:val="center"/>
+              <w:rPr>
+                <w:b/>
+                <w:bCs/>
+              </w:rPr>
+            </w:pPr>
+            <w:r>
+              <w:t>nome_premio</w:t>
+            </w:r>
+          </w:p>
+        </w:tc>
+        <w:tc>
+          <w:tcPr>
+            <w:tcW w:w="2228" w:type="dxa"/>
+          </w:tcPr>
+          <w:p>
+            <w:pPr>
+              <w:jc w:val="center"/>
+            </w:pPr>
+            <w:r>
+              <w:t>VARCHAR</w:t>
+            </w:r>
+          </w:p>
+        </w:tc>
+        <w:tc>
+          <w:tcPr>
+            <w:tcW w:w="3089" w:type="dxa"/>
+          </w:tcPr>
+          <w:p>
+            <w:pPr>
+              <w:jc w:val="center"/>
+            </w:pPr>
+            <w:r>
+              <w:t>VARCHAR</w:t>
+            </w:r>
+          </w:p>
+        </w:tc>
+      </w:tr>
+      <w:tr>
+        <w:tc>
+          <w:tcPr>
+            <w:tcW w:w="4311" w:type="dxa"/>
+          </w:tcPr>
+          <w:p>
+            <w:pPr>
+              <w:jc w:val="center"/>
+            </w:pPr>
+            <w:r>
+              <w:t>punti_richiesti</w:t>
+            </w:r>
+          </w:p>
+        </w:tc>
+        <w:tc>
+          <w:tcPr>
+            <w:tcW w:w="2228" w:type="dxa"/>
+          </w:tcPr>
+          <w:p>
+            <w:pPr>
+              <w:jc w:val="center"/>
+            </w:pPr>
+            <w:r>
+              <w:t>INT</w:t>
+            </w:r>
+          </w:p>
+        </w:tc>
+        <w:tc>
+          <w:tcPr>
+            <w:tcW w:w="3089" w:type="dxa"/>
+          </w:tcPr>
+          <w:p>
+            <w:pPr>
+              <w:jc w:val="center"/>
+            </w:pPr>
+            <w:r>
+              <w:t>&gt; 0</w:t>
             </w:r>
           </w:p>
         </w:tc>
@@ -2543,6 +2272,14 @@
         </w:rPr>
         <w:t>.id_utente e utenti.id_utente</w:t>
       </w:r>
+      <w:r>
+        <w:rPr>
+          <w:color w:val="0070C0"/>
+          <w:sz w:val="24"/>
+          <w:szCs w:val="24"/>
+        </w:rPr>
+        <w:br/>
+      </w:r>
     </w:p>
     <w:p>
       <w:pPr>
@@ -2550,50 +2287,6 @@
           <w:color w:val="0070C0"/>
           <w:sz w:val="24"/>
           <w:szCs w:val="24"/>
-        </w:rPr>
-      </w:pPr>
-      <w:r>
-        <w:rPr>
-          <w:color w:val="0070C0"/>
-          <w:sz w:val="24"/>
-          <w:szCs w:val="24"/>
-        </w:rPr>
-        <w:t>VINCOL</w:t>
-      </w:r>
-      <w:r>
-        <w:rPr>
-          <w:color w:val="0070C0"/>
-          <w:sz w:val="24"/>
-          <w:szCs w:val="24"/>
-        </w:rPr>
-        <w:t>I</w:t>
-      </w:r>
-      <w:r>
-        <w:rPr>
-          <w:color w:val="0070C0"/>
-          <w:sz w:val="24"/>
-          <w:szCs w:val="24"/>
-        </w:rPr>
-        <w:t xml:space="preserve"> DI INTEGRITÀ REFERENZIALE: Tra </w:t>
-      </w:r>
-      <w:r>
-        <w:rPr>
-          <w:color w:val="0070C0"/>
-          <w:sz w:val="24"/>
-          <w:szCs w:val="24"/>
-        </w:rPr>
-        <w:t>riscossione.id_premio e premi.id_premio</w:t>
-      </w:r>
-    </w:p>
-    <w:p>
-      <w:pPr>
-        <w:spacing w:before="100" w:beforeAutospacing="1" w:after="100" w:afterAutospacing="1" w:line="240" w:lineRule="auto"/>
-        <w:rPr>
-          <w:rFonts w:eastAsia="Times New Roman" w:cs="Times New Roman"/>
-          <w:b/>
-          <w:bCs/>
-          <w:color w:val="3A7C22" w:themeColor="accent6" w:themeShade="BF"/>
-          <w:lang w:eastAsia="it-IT"/>
         </w:rPr>
       </w:pPr>
       <w:r>
@@ -2796,7 +2489,6 @@
           <w:rFonts w:eastAsia="Times New Roman" w:cs="Times New Roman"/>
           <w:lang w:eastAsia="it-IT"/>
         </w:rPr>
-        <w:lastRenderedPageBreak/>
         <w:t>Tabella obiettivi con distinzione in sfide</w:t>
       </w:r>
       <w:r>
@@ -2901,42 +2593,25 @@
     <w:p>
       <w:pPr>
         <w:rPr>
-          <w:color w:val="000000" w:themeColor="text1"/>
+          <w:rFonts w:eastAsia="Times New Roman" w:cs="Times New Roman"/>
+          <w:b/>
+          <w:bCs/>
+          <w:color w:val="BF4E14" w:themeColor="accent2" w:themeShade="BF"/>
+          <w:lang w:eastAsia="it-IT"/>
         </w:rPr>
       </w:pPr>
     </w:p>
     <w:p>
       <w:pPr>
         <w:rPr>
+          <w:rFonts w:eastAsia="Times New Roman" w:cs="Times New Roman"/>
           <w:b/>
           <w:bCs/>
-          <w:color w:val="FF0000"/>
-          <w:sz w:val="24"/>
-          <w:szCs w:val="24"/>
+          <w:color w:val="BF4E14" w:themeColor="accent2" w:themeShade="BF"/>
+          <w:lang w:eastAsia="it-IT"/>
         </w:rPr>
       </w:pPr>
     </w:p>
-    <w:p>
-      <w:pPr>
-        <w:rPr>
-          <w:b/>
-          <w:bCs/>
-          <w:color w:val="FF0000"/>
-          <w:sz w:val="24"/>
-          <w:szCs w:val="24"/>
-        </w:rPr>
-      </w:pPr>
-    </w:p>
-    <w:p>
-      <w:pPr>
-        <w:rPr>
-          <w:color w:val="0070C0"/>
-          <w:sz w:val="24"/>
-          <w:szCs w:val="24"/>
-        </w:rPr>
-      </w:pPr>
-    </w:p>
-    <w:p/>
     <w:p/>
     <w:sectPr>
       <w:pgSz w:w="11906" w:h="16838"/>
@@ -3585,7 +3260,7 @@
   <w:style w:type="paragraph" w:default="1" w:styleId="Normale">
     <w:name w:val="Normal"/>
     <w:qFormat/>
-    <w:rsid w:val="00623203"/>
+    <w:rsid w:val="00F76581"/>
   </w:style>
   <w:style w:type="paragraph" w:styleId="Titolo1">
     <w:name w:val="heading 1"/>

</xml_diff>